<commit_message>
adding some more writeup things
</commit_message>
<xml_diff>
--- a/CHF_Research_Paper.docx
+++ b/CHF_Research_Paper.docx
@@ -104,7 +104,68 @@
     </w:p>
     <w:p>
       <w:r>
-        <w:t>Given how much depends on getting this number right, the natural question is how CHF is actually predicted in practice today. For decades, the standard tools have been empirical correlations and look-up tables, such as the widely used 2006 Groeneveld look-up table, built by fitting mathematical relationships directly to large collections of experimental measurements. These tools work well within the specific range of pressures, flow rates, geometries, and fluids they were built from, since they were tuned on exactly that data. The problem shows up at the edges. Step outside the original database, into a new fluid, an unusual tube diameter, a different surface condition, or a pressure range with little experimental coverage, and these correlations can degrade sharply or fail outright, precisely because they have no underlying mechanistic understanding of the boiling crisis to fall back on. They interpolate well; they extrapolate poorly. This gap between the conditions a real reactor might encounter and the narrow window a correlation was actually validated against is exactly the opening that data-driven and machine learning methods have started to fill, and it is the motivation behind the growing body of CHF research summarized in Figure 1.</w:t>
+        <w:t>Given how much depends on getting this number right, the natural question is how CHF is actually predicted in practice today. For decades, the standard tools have been empirical correlations and look up tables, such as the widely used 2006 Groeneveld look up table, built by fitting mathematical relationships directly to large collections of experimental measurements. These correlations work, and they have served the industry for decades, but they carry a specific set of limitations that are worth naming individually, since each one shapes exactly where a data driven alternative could actually help.</w:t>
+      </w:r>
+    </w:p>
+    <w:p>
+      <w:pPr>
+        <w:pStyle w:val="ListBullet"/>
+      </w:pPr>
+      <w:r>
+        <w:t>Empirical nature. Correlations such as the Groeneveld look up table are curve fits to measured data, not derivations from a physical model of the boiling crisis. The functional form used, often a power law or a piecewise multiplicative combination of pressure, mass flux, and quality, is chosen because it fits the available data reasonably well, not because it follows from the underlying physics of bubble growth, microlayer evaporation, or vapor escape. This means the correlation carries no built in understanding of why CHF happens, only a description of what it looked like in the specific experiments it was fitted to.</w:t>
+      </w:r>
+    </w:p>
+    <w:p>
+      <w:pPr>
+        <w:pStyle w:val="ListBullet"/>
+      </w:pPr>
+      <w:r>
+        <w:t>Narrow experimental ranges. Every correlation is only as good as the data it was built from, and that data was collected within a specific window of pressure, mass flux, quality, and tube diameter. Even the 2006 Groeneveld look up table, despite being one of the broadest CHF databases ever assembled, still contains entire regions that are interpolated or extrapolated rather than measured directly, simply because no experiment has ever been run at every combination of conditions a reactor could see.</w:t>
+      </w:r>
+    </w:p>
+    <w:p>
+      <w:pPr>
+        <w:pStyle w:val="ListBullet"/>
+      </w:pPr>
+      <w:r>
+        <w:t>Dependence on specific fluids. Correlations built from water data do not transfer cleanly to other fluids, even when the flow conditions look similar on paper. Pioro et al. (2002) compared CHF under matched flow conditions for water and for R-134a, a common refrigerant used as a water surrogate in scaled experiments, and found that the effect of surface orientation on CHF was measurably stronger for R-134a than for water under otherwise equivalent conditions. A correlation tuned only on water data has no way of knowing this discrepancy exists, let alone correcting for it.</w:t>
+      </w:r>
+    </w:p>
+    <w:p>
+      <w:pPr>
+        <w:pStyle w:val="ListBullet"/>
+      </w:pPr>
+      <w:r>
+        <w:t>Dependence on particular geometries. A CHF correlation built for one channel geometry, a round tube, an annulus, a rod bundle, does not automatically apply to another. The usual fix is a geometry correction factor, but even this correction is not constant. Tanase et al. (2009) tabulated a diameter correction exponent for CHF across 24 separate combinations of pressure, mass flux, and quality, and found the exponent itself ranging from about minus 0.3 to plus 0.6 depending on which regime a given condition fell into. In other words, there is no single number that describes how CHF scales with tube diameter, only a patchwork of regime specific values.</w:t>
+      </w:r>
+    </w:p>
+    <w:p>
+      <w:pPr>
+        <w:pStyle w:val="ListBullet"/>
+      </w:pPr>
+      <w:r>
+        <w:t>Difficulty incorporating surface characteristics. As the next section describes in detail, conventional correlations are built almost entirely around bulk flow variables, pressure, mass flux, and quality, and have no natural input slot for surface roughness, wettability, coating, or material. A correlation can be refit for one specific engineered surface, but it cannot generalize to a new surface it has never seen, because surface condition was never part of its functional form to begin with.</w:t>
+      </w:r>
+    </w:p>
+    <w:p>
+      <w:pPr>
+        <w:pStyle w:val="ListBullet"/>
+      </w:pPr>
+      <w:r>
+        <w:t>Poor extrapolation. Because these correlations are fitted rather than derived, they interpolate well within their original database and extrapolate poorly outside it. Step into a new fluid, an unusual diameter, or a pressure range with little experimental coverage, and a correlation can degrade sharply or fail outright, precisely because it has no mechanistic understanding of the boiling crisis to fall back on once the data runs out.</w:t>
+      </w:r>
+    </w:p>
+    <w:p>
+      <w:pPr>
+        <w:pStyle w:val="ListBullet"/>
+      </w:pPr>
+      <w:r>
+        <w:t>Nonlinear coupling among parameters. CHF does not respond to pressure, mass flux, diameter, and quality independently. It responds to specific combinations of them, and the way these parameters interact changes from one flow regime to another. The same Tanase et al. (2009) diameter exponent data makes this concrete: the exponent describing how CHF scales with diameter is not one number but 24 different numbers, each valid only for a specific combination of pressure, mass flux, and quality. Capturing this kind of regime dependent, multi parameter interaction with a single tidy equation is exactly the sort of problem that empirical correlations, built around simple multiplicative forms, are poorly suited to represent.</w:t>
+      </w:r>
+    </w:p>
+    <w:p>
+      <w:r>
+        <w:t>This gap between the conditions a real reactor might encounter and the narrow, fluid specific, geometry specific window a correlation was actually validated against is exactly the opening that data driven and machine learning methods have started to fill, and it is the motivation behind the growing body of CHF research summarized in Figure 1.</w:t>
       </w:r>
     </w:p>
     <w:p/>
@@ -164,7 +225,81 @@
         <w:pStyle w:val="Heading2"/>
       </w:pPr>
       <w:r>
-        <w:t>1.4 Influence of Surface Characteristics</w:t>
+        <w:t>1.4 Machine Learning as a Potential Solution</w:t>
+      </w:r>
+    </w:p>
+    <w:p>
+      <w:r>
+        <w:t>Machine learning offers a genuinely different way of building a CHF model, and it is worth being precise about exactly which of the seven limitations above it addresses directly, which it improves only partially, and which it does not solve just by virtue of being machine learning. Taken point by point against the same list:</w:t>
+      </w:r>
+    </w:p>
+    <w:p>
+      <w:pPr>
+        <w:pStyle w:val="ListBullet"/>
+      </w:pPr>
+      <w:r>
+        <w:t>Empirical nature. Machine learning models are also fitted to data rather than derived from first principles, so in a strict sense they do not remove the empirical nature of CHF prediction. What changes is the flexibility of the fit. A correlation is locked into a functional form chosen in advance, usually a power law or a fixed multiplicative combination, while a neural network can represent a much wider family of shapes, including sharp transitions and interactions that a person would not think to write down as a single equation. This project's own models reached an R-squared of 0.963 (MLP) and 0.968 (Transformer) under interpolation testing, a level of fit that a fixed-form correlation is not built to achieve across such a wide range of conditions at once.</w:t>
+      </w:r>
+    </w:p>
+    <w:p>
+      <w:pPr>
+        <w:pStyle w:val="ListBullet"/>
+      </w:pPr>
+      <w:r>
+        <w:t>Narrow experimental ranges. Merging many independent datasets into one much larger training set directly widens the range of conditions a model has actually seen. A collaborator on this project combined seven independent CHF sources into a single 28,470 row dataset spanning tubes, annuli, helical coils, and pin-fin surfaces, a far broader coverage than any single correlation's original database. This genuinely helps, but it is worth being honest about what it does not do: it pushes the boundary of the covered range outward, it does not remove the boundary. A model trained on this larger dataset can still only interpolate within it.</w:t>
+      </w:r>
+    </w:p>
+    <w:p>
+      <w:pPr>
+        <w:pStyle w:val="ListBullet"/>
+      </w:pPr>
+      <w:r>
+        <w:t>Dependence on specific fluids. Rather than needing a separate correlation refit for every fluid, a machine learning model can take fluid properties directly as input features, things like reduced pressure or other dimensionless groups that describe a fluid's thermodynamic state relative to its critical point. This project's own feature set is built this way, and the per domain fine-tuning results, R-squared values ranging from about 0.48 to 0.91 depending on the fluid and geometry combination, show a single underlying model architecture adapting across genuinely different fluids, rather than requiring a separate hand-built correlation for each one.</w:t>
+      </w:r>
+    </w:p>
+    <w:p>
+      <w:pPr>
+        <w:pStyle w:val="ListBullet"/>
+      </w:pPr>
+      <w:r>
+        <w:t>Dependence on particular geometries. The same logic applies to geometry. Instead of a single diameter correction exponent applied uniformly, a model can take geometry descriptors, diameter, geometry family, hydraulic diameter, as direct inputs and learn how CHF depends on them jointly with the flow conditions, rather than through a bolted-on correction factor. The cross-geometry fine-tuning results from this project's own testing, spanning five different geometry and fluid combinations, are a direct test of this idea.</w:t>
+      </w:r>
+    </w:p>
+    <w:p>
+      <w:pPr>
+        <w:pStyle w:val="ListBullet"/>
+      </w:pPr>
+      <w:r>
+        <w:t>Difficulty incorporating surface characteristics. Surface descriptors, roughness, contact angle, coating type, can simply be added as extra columns in the input data, something a bulk flow correlation has no mechanism for at all. The pin-fin pool-boiling dataset used in this project's own testing includes exactly this kind of surface-specific information, and a model trained on it can, in principle, learn how CHF shifts with surface condition directly from the data rather than needing a person to encode that relationship by hand.</w:t>
+      </w:r>
+    </w:p>
+    <w:p>
+      <w:pPr>
+        <w:pStyle w:val="ListBullet"/>
+      </w:pPr>
+      <w:r>
+        <w:t>Poor extrapolation. This is the point where it is important not to overclaim. Plain machine learning does not fix poor extrapolation just by being machine learning; in several respects it can be worse than a classical correlation outside its training range, since a neural network has no physical constraint forcing it to behave sensibly once it leaves the data it was trained on. Under a hard pressure-based extrapolation split, this project's own testing found random-forest and gradient-boosted tree models collapsing to an R-squared of roughly 0.41 to 0.45, and a separate pretrain-and-fine-tune transfer learning study reported a standard neural network reaching a negative R-squared of minus 6.56 under a comparable pressure-based extrapolation test. What actually helps is a more deliberate training strategy, not simply switching from a correlation to a neural network. This project's own model, pretrained on a large synthetic dataset spanning a wide parameter space and then fine-tuned on real experimental data with a deliberately held-out high-pressure extrapolation region, reached an R-squared of 0.916 (MLP) and 0.953 (Transformer) on that held-out extrapolation test, far above the tree-based results under the same split. Yang et al. (2025) report a similar pattern, reaching an R-squared of 0.9632 with a physics-informed hybrid approach rather than a plain data fit. The lesson is specific rather than general: machine learning does not solve extrapolation automatically, but pretraining, transfer learning, and physics-informed structure, used deliberately, can measurably narrow the gap in a way that neither a classical correlation nor a naively trained neural network achieves on its own.</w:t>
+      </w:r>
+    </w:p>
+    <w:p>
+      <w:pPr>
+        <w:pStyle w:val="ListBullet"/>
+      </w:pPr>
+      <w:r>
+        <w:t>Nonlinear coupling among parameters. This is arguably where machine learning has the clearest structural advantage. A neural network is, by construction, a universal function approximator: it does not need a person to pre-specify how pressure, mass flux, diameter, and quality interact, or to split the parameter space into 24 separate regimes the way the Tanase et al. (2009) diameter exponent table does. It learns the interactions directly from the data. The practical result in this project's own testing is a single model, not two dozen regime-specific equations, reaching an R-squared above 0.96 on interpolation testing across the full combined range of pressure, mass flux, quality, and diameter, without any manual splitting of the parameter space into separate regimes.</w:t>
+      </w:r>
+    </w:p>
+    <w:p>
+      <w:r>
+        <w:t>None of this means machine learning is a drop-in replacement for physical understanding, or that it should be trusted blindly outside the range of conditions it has actually seen. But point by point, it directly addresses five of the seven limitations above, fluid dependence, geometry dependence, surface characteristics, nonlinear coupling, and to a real extent the narrow-range problem, offers a genuine but carefully qualified improvement on a sixth, poor extrapolation, when combined with pretraining and transfer learning rather than used naively, and is honest, rather than evasive, about the seventh, its own empirical nature. That is the case, grounded in the results already discussed above and summarized in Figure 1, for treating machine learning as a genuinely promising direction for CHF prediction, rather than as a buzzword substitute for the correlations it is trying to improve on.</w:t>
+      </w:r>
+    </w:p>
+    <w:p>
+      <w:pPr>
+        <w:pStyle w:val="Heading2"/>
+      </w:pPr>
+      <w:r>
+        <w:t>1.5 Influence of Surface Characteristics</w:t>
       </w:r>
     </w:p>
     <w:p>
@@ -215,6 +350,48 @@
     <w:p>
       <w:r>
         <w:t>Taken together, nucleation site density, bubble departure behavior, liquid replenishment, microlayer evaporation, and vapor escape are not independent side details. They are the actual mechanisms that determine when and where a dry spot first appears and whether it grows into full dryout, and every one of the five surface properties discussed above acts by shifting one or more of these mechanisms. Any CHF prediction approach that ignores surface condition is, in effect, ignoring the mechanism itself and hoping that a bulk flow correlation happens to average it out.</w:t>
+      </w:r>
+    </w:p>
+    <w:p>
+      <w:pPr>
+        <w:pStyle w:val="Heading2"/>
+      </w:pPr>
+      <w:r>
+        <w:t>1.6 Limitations of Current CHF Prediction Approaches</w:t>
+      </w:r>
+    </w:p>
+    <w:p>
+      <w:r>
+        <w:t>It is worth being direct about something the field does not always state plainly: predicting CHF accurately across the full range of fluids, geometries, surfaces, and flow regimes that real engineering applications actually encounter is not a solved problem, no matter how the headline accuracy numbers in recent papers might read. A model that reports an R-squared of 0.95 or higher is reporting the truth, but that number is almost always measured on a test set drawn from the same distribution as its training data. What that number does not tell you is how the same model performs the moment it is asked to generalize beyond that distribution, and the gap between the two can be enormous.</w:t>
+      </w:r>
+    </w:p>
+    <w:p>
+      <w:pPr>
+        <w:pStyle w:val="ListBullet"/>
+      </w:pPr>
+      <w:r>
+        <w:t>Interpolation is not extrapolation. When a model is evaluated on a random split of a large, well-populated dataset, it is effectively being asked to fill in gaps between points it has already seen many close neighbors of. This is a genuinely easier task than predicting CHF for a pressure, geometry, or surface condition that lies outside anything in the training data, and the difference in reported accuracy between the two settings is not a small effect. A recent pretrain-and-fine-tune transfer learning study found that a standard neural network achieved a negative R-squared value of minus 6.56 when tested on pressures above a cutoff that excluded only the highest end of its training range, even though the same architecture scored well above 0.9 on a random split of the identical dataset. Random-forest and gradient-boosted tree ensembles, evaluated in this project's own earlier testing under a hard pressure-based extrapolation split, showed the same pattern, collapsing from near-perfect interpolation scores to an R-squared of roughly 0.41 to 0.45 once asked to predict outside the pressure range they were trained on. This happens because tree-based models are fundamentally piecewise-constant: they can only predict values close to what they have already seen, and have no mechanism for recognizing that a physical trend should continue smoothly past the edge of their training data.</w:t>
+      </w:r>
+    </w:p>
+    <w:p>
+      <w:pPr>
+        <w:pStyle w:val="ListBullet"/>
+      </w:pPr>
+      <w:r>
+        <w:t>Generalizing across surfaces and sources is harder still. A collaborator on this project recently assembled a unified, 28,470-row dataset merging seven independent point-level CHF sources, tubes, annuli, helical coils, and pin-fin pool-boiling surfaces among them, and evaluated the same model bake-off (a standard neural network, random forest, gradient-boosted trees, Gaussian process regression, and a physics-informed neural network) under four increasingly demanding test strategies. On a random stratified split, every model looked strong, with the best reaching an R-squared of 0.968. On a condition-wise split, where only the highest-pressure portion of each source was held out, the best models still managed roughly 0.89, but the physics-informed neural network collapsed to an R-squared of minus 64.9, far worse than simply predicting the average CHF value every time. On a surface-wise split, where two entire geometries (pin-fin pool boiling and helical coils) were withheld completely rather than just a condition range, even the best-performing tree models dropped to an R-squared of about 0.17 to 0.22, while the standard neural network and the physics-informed model both produced results so unstable that their R-squared values fell below minus 3900. Finally, under a leave-one-source-out cross-validation (systematically holding out each of the seven sources in turn and pooling the results), the best model reached an R-squared of about 0.78, a real and useful number, but still a clear step down from the 0.97 the same approach reported on the random split of the same underlying data.</w:t>
+      </w:r>
+    </w:p>
+    <w:p>
+      <w:pPr>
+        <w:pStyle w:val="ListBullet"/>
+      </w:pPr>
+      <w:r>
+        <w:t>Physics-informed does not automatically mean robust. One of the more counterintuitive findings in the results above is that the physics-informed neural network was not the most reliable model under distribution shift; in several cases it was the least reliable, producing the single worst results of any model tested. This matters because it is tempting to assume that adding physical structure to a model automatically buys generalization ability. It does not, on its own. How the physics is incorporated (as a hard constraint, a soft penalty, a pretrained prior, or a residual correction) determines whether it actually helps outside the training distribution, and a poorly chosen physics-informed architecture can perform worse than a plain data-driven model with no physical structure at all.</w:t>
+      </w:r>
+    </w:p>
+    <w:p>
+      <w:r>
+        <w:t>Taken together, these results point to a conclusion that is easy to state but important not to gloss over: a single reported R-squared value, without knowing exactly how the test set relates to the training data, says very little about whether a CHF prediction model is actually reliable for a new fluid, a new geometry, or a new surface it has never encountered. Interpolation performance and extrapolation performance are, in effect, two different questions, and a model that answers one well can fail the other by several orders of magnitude. Any CHF prediction approach that claims broad, large-scale applicability needs to be evaluated against genuinely held-out conditions and sources, not just a random split of its own training database, before that claim can be trusted.</w:t>
       </w:r>
     </w:p>
     <w:sectPr>

</xml_diff>

<commit_message>
adding some new portion in the paper
</commit_message>
<xml_diff>
--- a/CHF_Research_Paper.docx
+++ b/CHF_Research_Paper.docx
@@ -299,7 +299,81 @@
         <w:pStyle w:val="Heading2"/>
       </w:pPr>
       <w:r>
-        <w:t>1.5 Influence of Surface Characteristics</w:t>
+        <w:t>1.5 Existing ML-based CHF Prediction</w:t>
+      </w:r>
+    </w:p>
+    <w:p>
+      <w:r>
+        <w:t>With the case for machine learning established, it is worth looking at what has actually been tried so far. Over roughly the last decade and a half, a fairly consistent set of algorithms keeps showing up across the CHF literature: artificial neural networks, random forest, gradient boosting, XGBoost, support vector regression, Gaussian process regression, and deeper neural network architectures. Reviewing what each of these has actually achieved, including where this project's own testing produced comparable numbers, gives a clearer picture of where the field genuinely stands.</w:t>
+      </w:r>
+    </w:p>
+    <w:p>
+      <w:pPr>
+        <w:pStyle w:val="ListBullet"/>
+      </w:pPr>
+      <w:r>
+        <w:t>Artificial Neural Networks (ANN). A standard fully connected neural network is the most common starting point in CHF machine learning studies, and it generally performs well on a like-for-like test. This project's own testing found an ANN reaching an R-squared of 0.921 on a random split of the collaborator's unified 28,470-row dataset, and Yang et al. (2025) report an R-squared of 0.9632 with a physics-informed architecture built on the same underlying network family. That accuracy is not guaranteed to hold up once the test conditions shift: the same ANN in this project's own testing dropped to an R-squared of 0.515 under a condition-wise split, and collapsed to an R-squared of roughly minus 4133 once two entire surface types were withheld under a surface-wise split.</w:t>
+      </w:r>
+    </w:p>
+    <w:p>
+      <w:pPr>
+        <w:pStyle w:val="ListBullet"/>
+      </w:pPr>
+      <w:r>
+        <w:t>Random Forest. A random forest builds many decision trees on random subsets of the data and features, then averages their predictions, which tends to make it more stable than a single model. In this project's own testing, random forest reached an R-squared of 0.965 on a random split, still a respectable 0.875 under a condition-wise split, but only 0.219 once two surface types were withheld entirely, and 0.269 under a leave-one-source-out test across all seven sources.</w:t>
+      </w:r>
+    </w:p>
+    <w:p>
+      <w:pPr>
+        <w:pStyle w:val="ListBullet"/>
+      </w:pPr>
+      <w:r>
+        <w:t>Gradient Boosting. Gradient boosting builds trees sequentially, with each new tree correcting the errors left by the ones before it. In this project's own testing, a gradient-boosted tree model reached an R-squared of 0.968 on a random split, the best of the five algorithms compared, and it remained the strongest or tied-strongest model under every one of the four test strategies used, including an R-squared of 0.784 under the leave-one-source-out test, the hardest of the four.</w:t>
+      </w:r>
+    </w:p>
+    <w:p>
+      <w:pPr>
+        <w:pStyle w:val="ListBullet"/>
+      </w:pPr>
+      <w:r>
+        <w:t>XGBoost. This specific, heavily optimized implementation of gradient boosting was not part of this project's own model comparison, but it appears repeatedly in the wider literature. A 2025 study of CHF prediction in a 5x5 rod bundle assembly, using over 6000 datapoints and fifteen input features, compared a Transformer, XGBoost, random forest, KNN, SVM, and AdaBoost, and found XGBoost reaching an R-squared above 0.94, just behind the Transformer's 0.956, while needing substantially less computation. Its SHAP-based feature ranking in that study identified heated rod length as the single most influential input.</w:t>
+      </w:r>
+    </w:p>
+    <w:p>
+      <w:pPr>
+        <w:pStyle w:val="ListBullet"/>
+      </w:pPr>
+      <w:r>
+        <w:t>Support Vector Regression (SVR). SVR looks for the flattest function that still fits the training data within a set error margin, which can make it comparatively resistant to overfitting on smaller datasets. A 2024 comparison study evaluated a neural network, Gaussian process regression, and nu-support vector regression on a large CHF database and reported the predicted-to-measured ratio standard deviation at 12.3 percent for the neural network, about three times tighter than the 2006 look up table, and 17.7 percent for both GPR and nu-SVR, about two times tighter than the look up table. A separate study on narrow rectangular channel CHF, comparing a back-propagation neural network, random forest, SVR, and a long short-term memory model, found the neural network reaching the lowest prediction error of the four.</w:t>
+      </w:r>
+    </w:p>
+    <w:p>
+      <w:pPr>
+        <w:pStyle w:val="ListBullet"/>
+      </w:pPr>
+      <w:r>
+        <w:t>Gaussian Process Regression (GPR). This project's own testing of GPR tells a cautionary story about how much an algorithm's usefulness depends on how it is set up. GPR reached an R-squared of 0.872 on a random split, but only a slightly negative R-squared of about minus 0.05 under a condition-wise split, meaning it performed no better than simply predicting the average CHF value once asked to extrapolate to higher pressures. A separate kernel-comparison study reported that GPR with a properly chosen anisotropic kernel can outperform both ANN and SVR for CHF prediction, which points to kernel choice, not the algorithm family itself, as the deciding factor.</w:t>
+      </w:r>
+    </w:p>
+    <w:p>
+      <w:pPr>
+        <w:pStyle w:val="ListBullet"/>
+      </w:pPr>
+      <w:r>
+        <w:t>Deep Neural Networks (DNN). Architectures with more layers and specialized structure, rather than a single hidden layer, have pushed reported accuracy higher still in recent CHF studies. A Bayesian neural network study reported an R-squared of 0.986, and a Transformer architecture using unit-aware input embeddings reached 0.9818 on a large public tube database, both notably higher than the plain ANN figures above. This is consistent with the overall trend shown earlier in Figure 1: as architectures have grown deeper and more specialized, reported interpolation accuracy has climbed fairly steadily over the last few years.</w:t>
+      </w:r>
+    </w:p>
+    <w:p>
+      <w:r>
+        <w:t>Across all seven of these approaches, a consistent and important pattern emerges, one that is easy to miss if the only number reported is a single headline R-squared. Every one of them looks strong on a random split of a training-like dataset, and every one of them can lose most or all of that accuracy once tested outside that distribution, whether that means a higher pressure range, a different flow condition, or, most severely, a surface type it has never encountered before. What is largely missing across the great majority of these studies, this project's own model comparison included, is a systematic test of generalization: results are almost always reported for a single train-test split, usually random, without checking whether the model has actually learned the underlying physical relationship or has simply learned the specific surfaces and conditions represented in its own training data. This gap, a strong focus on maximizing accuracy over demonstrating genuine generalization and physical consistency across unseen surface conditions, is exactly the gap the remainder of this project's own testing was designed to expose and measure directly, rather than assume away.</w:t>
+      </w:r>
+    </w:p>
+    <w:p>
+      <w:pPr>
+        <w:pStyle w:val="Heading2"/>
+      </w:pPr>
+      <w:r>
+        <w:t>1.6 Influence of Surface Characteristics</w:t>
       </w:r>
     </w:p>
     <w:p>
@@ -357,7 +431,7 @@
         <w:pStyle w:val="Heading2"/>
       </w:pPr>
       <w:r>
-        <w:t>1.6 Limitations of Current CHF Prediction Approaches</w:t>
+        <w:t>1.7 Limitations of Current CHF Prediction Approaches</w:t>
       </w:r>
     </w:p>
     <w:p>
@@ -392,6 +466,194 @@
     <w:p>
       <w:r>
         <w:t>Taken together, these results point to a conclusion that is easy to state but important not to gloss over: a single reported R-squared value, without knowing exactly how the test set relates to the training data, says very little about whether a CHF prediction model is actually reliable for a new fluid, a new geometry, or a new surface it has never encountered. Interpolation performance and extrapolation performance are, in effect, two different questions, and a model that answers one well can fail the other by several orders of magnitude. Any CHF prediction approach that claims broad, large-scale applicability needs to be evaluated against genuinely held-out conditions and sources, not just a random split of its own training database, before that claim can be trusted.</w:t>
+      </w:r>
+    </w:p>
+    <w:p>
+      <w:pPr>
+        <w:pStyle w:val="Heading2"/>
+      </w:pPr>
+      <w:r>
+        <w:t>1.8 Research Gap</w:t>
+      </w:r>
+    </w:p>
+    <w:p>
+      <w:r>
+        <w:t>Given everything discussed above, the specific gaps this project focuses on can be stated plainly, in four parts, each grounded in a pattern that showed up repeatedly in this project's own testing rather than assumed in the abstract.</w:t>
+      </w:r>
+    </w:p>
+    <w:p>
+      <w:pPr>
+        <w:pStyle w:val="ListBullet"/>
+      </w:pPr>
+      <w:r>
+        <w:t>Gap 1: Existing CHF correlations inadequately account for engineered surface characteristics. As detailed in Section 1.6, roughness, wettability, contact angle, surface material, and orientation are established, physically important drivers of CHF, yet the correlations discussed in Section 1.3 were built almost entirely around bulk flow variables, pressure, mass flux, and quality, and have no input slot for any of them. This is not a minor omission: two of the seven sources in the collaborator's own unified dataset are surface-driven pin-fin and helical-coil pool-boiling data, and neither integrates naturally into a correlation that was never designed to take surface condition as an input in the first place.</w:t>
+      </w:r>
+    </w:p>
+    <w:p>
+      <w:pPr>
+        <w:pStyle w:val="ListBullet"/>
+      </w:pPr>
+      <w:r>
+        <w:t>Gap 2: Existing ML models frequently rely on randomly divided datasets, allowing samples from the same surface or operating condition to appear in both training and testing sets. The clearest evidence for this in this project's own testing is the gap between a random split and a condition-wise split of the exact same underlying data: the best model on a random split reached an R-squared of 0.968, but under a condition-wise split, where only the highest-pressure portion of each source was held out rather than points scattered randomly throughout, the best model dropped to about 0.89, and a physics-informed model collapsed to an R-squared of minus 64.9. A random split lets a model see near-neighbors of almost every test point during training, which inflates the reported accuracy without actually testing whether the model has learned anything that generalizes.</w:t>
+      </w:r>
+    </w:p>
+    <w:p>
+      <w:pPr>
+        <w:pStyle w:val="ListBullet"/>
+      </w:pPr>
+      <w:r>
+        <w:t>Gap 3: Cross-surface generalization remains insufficiently demonstrated. When two entire surface types, pin-fin pool boiling and helical coils, were withheld completely from training rather than just a condition range, even the best-performing tree-based model in this project's own testing dropped to an R-squared of about 0.17 to 0.22, and the standard neural network and the physics-informed neural network both produced R-squared values below minus 3900. Later testing in this project was built specifically to confront this gap directly, using techniques such as low-rank adapters and mixture-of-experts routing to try to transfer a model trained on tube and annulus data to genuinely new pool-boiling surfaces, rather than assuming a model trained on one geometry will simply carry over to another.</w:t>
+      </w:r>
+    </w:p>
+    <w:p>
+      <w:pPr>
+        <w:pStyle w:val="ListBullet"/>
+      </w:pPr>
+      <w:r>
+        <w:t>Gap 4: ML predictions are often treated as black boxes, with limited interpretation of how surface and thermal-hydraulic parameters control CHF. This project's own experience with a physics-informed neural network is a direct illustration of how this gap shows up in practice, not just in principle. The model was originally built around a small, physically motivated set of three core input features, but extending it to ingest the wider and more varied feature sets present across different real experimental datasets, so that it could be tested against data it was not originally designed for, made its internal behavior considerably harder to trace back to any specific physical mechanism. A model that started as a deliberately interpretable, physics-constrained design became, in practice, close to as opaque as a purely data-driven one once it had to accommodate real-world data heterogeneity.</w:t>
+      </w:r>
+    </w:p>
+    <w:p>
+      <w:r>
+        <w:t>Beyond these four formal gaps, two practical difficulties stood out repeatedly over the course of this project's own experiments, and both are worth stating plainly rather than glossing over. The first is that assembling usable data was, in practice, harder than training any individual model. Different sources reported different input features, different units, different geometry conventions, and different CHF detection criteria, and merging seven such sources into the collaborator's unified 28,470-row dataset required deciding, source by source, what could be combined honestly and what could not, well before any model was trained. Finding a single architecture that performed acceptably across every one of these differing feature sets and geometries was similarly difficult: a model tuned to do well on tube data with one set of available inputs did not automatically do well once asked to work with a pin-fin dataset carrying an entirely different set of surface descriptors.</w:t>
+      </w:r>
+    </w:p>
+    <w:p>
+      <w:r>
+        <w:t>The second difficulty is the one already illustrated by the numbers throughout this introduction, and it is worth stating the interpretation directly. Every tree ensemble and every plain neural network tested in this project's own work reached strong, sometimes excellent, accuracy under interpolation, R-squared values above 0.9 were common, but the same models performed far worse, in several cases catastrophically, once tested under extrapolation. Tree-based models settled around an R-squared of 0.41 to 0.45 under a pressure-based extrapolation split, while standard neural networks and the physics-informed neural network produced sharply negative R-squared values under condition-wise and surface-wise splits. A pattern this consistent, strong performance next to seen data and weak or collapsing performance beyond it, is hard to read as anything other than evidence that these models are not learning the underlying physical relationship governing CHF. What they appear to be doing instead is closer to locating a new point relative to the nearby points they have already seen and interpolating between them, which works well exactly as long as a new point actually has close neighbors in the training data, and fails as soon as it does not.</w:t>
+      </w:r>
+    </w:p>
+    <w:p>
+      <w:r>
+        <w:t>This project's own attempts at pretraining and fine-tuning, applied to both MLP and Transformer architectures in an effort to give the models a head start through transfer learning, ran into a related version of the same problem. Models trained this way performed well on data that resembled their pretraining distribution, but noticeably worse on genuinely unseen real experimental data carrying feature combinations the model had not encountered in that particular combination before. Pretraining and fine-tuning narrowed the interpolation-extrapolation gap relative to training from scratch, as shown by the improved extrapolation R-squared values reported earlier in this introduction, but it did not close it.</w:t>
+      </w:r>
+    </w:p>
+    <w:p>
+      <w:r>
+        <w:t>Part of the underlying difficulty is that many of the input features used across these datasets are not actually independent of one another. Density, pressure, and the forces acting on a growing bubble, for instance, are connected through well-established physical relationships, not coincidence. A model that receives these quantities simply as separate numeric columns has no built-in way of knowing that such relationships exist. It can only pick up on them indirectly, if the training data happens to cover enough combinations for the relationship to become visible in the numbers, and it does not carry that relationship forward reliably into combinations of conditions it has not seen. In that sense, the models used across this field, including in this project's own testing, are considerably less sophisticated than they can appear from a single strong headline accuracy score. They are good at recognizing patterns in data they have already been shown, and considerably less capable of anything that could reasonably be called physical reasoning.</w:t>
+      </w:r>
+    </w:p>
+    <w:p>
+      <w:pPr>
+        <w:pStyle w:val="Heading2"/>
+      </w:pPr>
+      <w:r>
+        <w:t>1.9 Objectives</w:t>
+      </w:r>
+    </w:p>
+    <w:p>
+      <w:r>
+        <w:t>Pulling together everything discussed so far, the aim of this work can be stated simply: to build a single, general machine learning pipeline for CHF prediction that a practicing engineer can actually trust and reuse, one that does not need to be redesigned, retrained from scratch, or handed a bespoke set of input features every time it meets a new fluid, geometry, or surface. A useful CHF model should behave less like a correlation tuned to one specific dataset and more like a tool: something that takes whatever thermal-hydraulic and surface information is available for a given case and returns a prediction that is at least as reliable as, and ideally considerably better than, the correlations and look-up tables currently in routine use, without asking the user to understand the details of how it was built.</w:t>
+      </w:r>
+    </w:p>
+    <w:p>
+      <w:r>
+        <w:t>This objective did not start out this way, and the path that led to it is itself part of the motivation for this paper. The early phase of this work set out to do what most of the literature reviewed in Section 1.5 does: maximize a single reported R-squared value. That effort succeeded on its own terms, this project's own pretrained and fine-tuned models reached an R-squared of 0.963 (MLP) and 0.968 (Transformer) when interpolating within the range of a single look-up-table-style dataset. The problem appeared once the same models were tested against the collaborator's independently assembled, multi-source experimental data described throughout this introduction. Accuracy dropped sharply and, in several configurations, collapsed outright, exactly the pattern documented in Sections 1.7 and 1.8. The conclusion was hard to avoid: a high R-squared on one dataset had been mistaken for a model that understood CHF, when what had actually happened was a model fitted closely, and somewhat narrowly, to the specific numerical patterns of that one dataset.</w:t>
+      </w:r>
+    </w:p>
+    <w:p>
+      <w:r>
+        <w:t>That realization reframed the objective. Rather than continuing to treat CHF prediction as a straightforward regression problem, feed in pressure, mass flux, and quality, and fit the output, the goal shifted toward architectures that have some chance of capturing the underlying physical structure of the problem: pretraining on a wide synthetic parameter space before fine-tuning on real data, using physically motivated and dimensionless input features rather than raw values alone, and testing generalization deliberately rather than assuming it. Creating genuinely new benchmarks along the way turned out to be harder than expected, mainly because reconciling the different input feature sets, units, and geometry conventions used across independent CHF datasets, discussed in Section 1.8, is itself a substantial undertaking, and finding one architecture that behaves consistently well across every one of them remains an open and only partially solved problem. That open problem is precisely what the remainder of this paper works on.</w:t>
+      </w:r>
+    </w:p>
+    <w:p>
+      <w:r>
+        <w:t>With that context, the specific objectives of this paper are:</w:t>
+      </w:r>
+    </w:p>
+    <w:p>
+      <w:pPr>
+        <w:pStyle w:val="ListBullet"/>
+      </w:pPr>
+      <w:r>
+        <w:t>Develop a single machine learning pipeline for CHF prediction that can be applied across multiple fluids, geometries, and surface conditions without requiring a bespoke model or a hand-picked feature set for each new case.</w:t>
+      </w:r>
+    </w:p>
+    <w:p>
+      <w:pPr>
+        <w:pStyle w:val="ListBullet"/>
+      </w:pPr>
+      <w:r>
+        <w:t>Evaluate that pipeline honestly, using random, condition-wise, surface-wise, and leave-one-source-out validation strategies side by side, rather than reporting a single random-split R-squared as if it represented general reliability.</w:t>
+      </w:r>
+    </w:p>
+    <w:p>
+      <w:pPr>
+        <w:pStyle w:val="ListBullet"/>
+      </w:pPr>
+      <w:r>
+        <w:t>Move the model's behavior closer to physical understanding rather than blind curve fitting, through pretraining on a broad synthetic parameter space, physically motivated input features, and transfer learning, and measure directly how much this narrows the gap between interpolation and extrapolation performance rather than assuming that it does.</w:t>
+      </w:r>
+    </w:p>
+    <w:p>
+      <w:pPr>
+        <w:pStyle w:val="ListBullet"/>
+      </w:pPr>
+      <w:r>
+        <w:t>Establish a general-purpose CHF prediction approach that a non-specialist user can apply with reasonable confidence, one whose accuracy has been demonstrated on data it was not trained on, not just on the dataset it was built from.</w:t>
+      </w:r>
+    </w:p>
+    <w:p>
+      <w:r>
+        <w:t>Everything that follows in this paper, the dataset construction, the model architectures, the validation strategy, and the interpretability analysis, is organized around testing whether these four objectives can actually be met, not just claimed.</w:t>
+      </w:r>
+    </w:p>
+    <w:p>
+      <w:pPr>
+        <w:pStyle w:val="Heading1"/>
+      </w:pPr>
+      <w:r>
+        <w:t>2. Experimental Database and CHF Measurements</w:t>
+      </w:r>
+    </w:p>
+    <w:p>
+      <w:pPr>
+        <w:pStyle w:val="Heading2"/>
+      </w:pPr>
+      <w:r>
+        <w:t>2.1 CHF Detection Criterion</w:t>
+      </w:r>
+    </w:p>
+    <w:p>
+      <w:r>
+        <w:t>Before any of the modeling described later in this paper is possible, every experimental CHF value in the underlying dataset first has to be identified from raw sensor readings, and that identification step is not as clean cut as it might sound. Different experimental facilities use different rules for deciding, from a stream of pressure, temperature, and heat flux measurements, exactly which data point counts as CHF. Four detection criteria account for most of the approaches used across the wider literature and across the sources merged into this project's own dataset.</w:t>
+      </w:r>
+    </w:p>
+    <w:p>
+      <w:pPr>
+        <w:pStyle w:val="ListBullet"/>
+      </w:pPr>
+      <w:r>
+        <w:t>Criterion 1, wall temperature excursion. This is the most common general-purpose criterion: heat flux or heater power is raised gradually while wall temperature is continuously logged, and CHF is identified as the point where the wall superheat time series shows the onset of a sustained upward excursion rather than settling to a new steady value, the sign that nucleate boiling has broken down and the surface is no longer being cooled effectively. Because it is the excursion itself, not a single instantaneous reading, that defines the point, most facilities record the full time history of heat flux, wall superheat, pressure, and mass flux around the event and locate CHF from where that excursion begins, rather than from any one isolated measurement.</w:t>
+      </w:r>
+    </w:p>
+    <w:p>
+      <w:pPr>
+        <w:pStyle w:val="ListBullet"/>
+      </w:pPr>
+      <w:r>
+        <w:t>Criterion 2, sudden wall-temperature increase. A closely related but more automatable version of Criterion 1 sets a numerical trip threshold rather than relying on inspection of the excursion curve after the fact. Rod bundle CHF experiments commonly trigger detection when a monitored wall temperature rises faster than about 10 degrees Celsius per second, or crosses an absolute ceiling such as 500 degrees Celsius, whichever comes first. A similar trip criterion has been used in downward-facing boiling surface experiments relevant to severe accident research, where a thermocouple reaching a preset value of 160 degrees Celsius within 10 to 15 seconds of the excursion beginning is used to automatically or manually cut heater power before the test section is physically damaged. This distinction matters for a dataset: a criterion built primarily as a safety trip is tuned to protect the equipment first and capture the exact CHF condition second, so its reported CHF value can carry a small, systematic bias toward slightly exceeding the true critical point.</w:t>
+      </w:r>
+    </w:p>
+    <w:p>
+      <w:pPr>
+        <w:pStyle w:val="ListBullet"/>
+      </w:pPr>
+      <w:r>
+        <w:t>Criterion 3, heat-flux reduction. In test setups where the heater surface temperature, rather than the heat flux, is the directly controlled variable, CHF shows up differently. As surface temperature is increased in steps, heat flux initially increases with it, tracing out the familiar boiling curve, but at CHF the curve turns over: heat flux stops increasing, and can even decrease, even as the wall temperature keeps rising. This turnover point in the boiling curve has been used directly as a CHF criterion in several studies, since it does not require detecting a temperature excursion at all, only a change in the slope of the heat-flux to wall-superheat relationship.</w:t>
+      </w:r>
+    </w:p>
+    <w:p>
+      <w:pPr>
+        <w:pStyle w:val="ListBullet"/>
+      </w:pPr>
+      <w:r>
+        <w:t>Criterion 4, visual detection. On transparent or optically accessible test sections, CHF can be identified directly by observing the boiling process itself rather than inferring it from a temperature or heat-flux signal. Total reflection imaging can detect the dry patches that form underneath vapor bubbles on a transparent heated surface, and high-speed and infrared imaging have been used to track dry-spot growth and bubble coalescence frame by frame as CHF is approached. This approach has also produced a finding that complicates the purely thermal criteria above: direct visual observation in water has found that irreversible dry spots first form at a surface temperature of around 134 degrees Celsius, well below the Leidenfrost temperature that a simple thermal criterion would predict, a reminder that a temperature-based definition of CHF is a practical proxy for the underlying physical event, not a first-principles description of it.</w:t>
+      </w:r>
+    </w:p>
+    <w:p>
+      <w:r>
+        <w:t>These four criteria do not always identify exactly the same physical instant, and switching between them, even applied to the same raw data, can shift the reported CHF value by a small but nonzero amount. Because the dataset used later in this paper is merged from multiple independent sources, each of which may have used a different one of these four criteria, this is itself a real, concrete source of the label noise and cross-source inconsistency discussed elsewhere in this paper, and one more reason why a CHF prediction model needs to be evaluated with some tolerance for the fact that its training labels were not all produced by an identical measurement procedure.</w:t>
       </w:r>
     </w:p>
     <w:sectPr>

</xml_diff>

<commit_message>
some more writeup changes
</commit_message>
<xml_diff>
--- a/CHF_Research_Paper.docx
+++ b/CHF_Research_Paper.docx
@@ -254,7 +254,7 @@
         <w:pStyle w:val="ListBullet"/>
       </w:pPr>
       <w:r>
-        <w:t>Dependence on specific fluids. Rather than needing a separate correlation refit for every fluid, a machine learning model can take fluid properties directly as input features, things like reduced pressure or other dimensionless groups that describe a fluid's thermodynamic state relative to its critical point. This project's own feature set is built this way, and the per domain fine-tuning results, R-squared values ranging from about 0.48 to 0.91 depending on the fluid and geometry combination, show a single underlying model architecture adapting across genuinely different fluids, rather than requiring a separate hand-built correlation for each one.</w:t>
+        <w:t>Dependence on specific fluids. Rather than needing a separate correlation refit for every fluid, a machine learning model can take fluid properties directly as input features, things like reduced pressure or other dimensionless groups that describe a fluid's thermodynamic state relative to its critical point. This project's own feature set is built this way, and the per domain fine-tuning results, R-squared values ranging from about 0.48 to 0.91 depending on the fluid and geometry combination, show a single underlying model architecture adapting across genuinely different fluids, rather than requiring a separate hand-built correlation for each one. This solution carries its own honest caveat, discussed further in Section 1.8: the same dimensionless representation that lets a model transfer across fluids can also make an unseen fluid look, numerically, like one the model has already seen, which is a real cost of this approach and not a minor detail.</w:t>
       </w:r>
     </w:p>
     <w:p>
@@ -486,7 +486,7 @@
         <w:pStyle w:val="ListBullet"/>
       </w:pPr>
       <w:r>
-        <w:t>Gap 1: Existing CHF correlations inadequately account for engineered surface characteristics. As detailed in Section 1.6, roughness, wettability, contact angle, surface material, and orientation are established, physically important drivers of CHF, yet the correlations discussed in Section 1.3 were built almost entirely around bulk flow variables, pressure, mass flux, and quality, and have no input slot for any of them. This is not a minor omission: two of the seven sources in the collaborator's own unified dataset are surface-driven pin-fin and helical-coil pool-boiling data, and neither integrates naturally into a correlation that was never designed to take surface condition as an input in the first place.</w:t>
+        <w:t>Gap 1: Existing CHF correlations inadequately account for engineered surface characteristics. As detailed in Section 1.6, roughness, wettability, contact angle, surface material, and orientation are established, physically important drivers of CHF, yet the correlations discussed in Section 1.3 were built almost entirely around bulk flow variables, pressure, mass flux, and quality, and have no input slot for any of them. This omission is not just structural, it can actively mislead a simple statistical analysis of surface effects: when roughness and CHF were correlated after pooling data across several engineered-surface studies, the relationship came out negative, roughness associated with lower CHF, but the same relationship measured within each individual study came out positive, roughness associated with higher CHF, matching the capillary-wicking mechanism the source papers themselves describe. Pooling surface data from different laboratories without accounting for which laboratory each row came from can reverse the sign of a real physical relationship, not merely blur it.</w:t>
       </w:r>
     </w:p>
     <w:p>
@@ -494,7 +494,7 @@
         <w:pStyle w:val="ListBullet"/>
       </w:pPr>
       <w:r>
-        <w:t>Gap 2: Existing ML models frequently rely on randomly divided datasets, allowing samples from the same surface or operating condition to appear in both training and testing sets. The clearest evidence for this in this project's own testing is the gap between a random split and a condition-wise split of the exact same underlying data: the best model on a random split reached an R-squared of 0.968, but under a condition-wise split, where only the highest-pressure portion of each source was held out rather than points scattered randomly throughout, the best model dropped to about 0.89, and a physics-informed model collapsed to an R-squared of minus 64.9. A random split lets a model see near-neighbors of almost every test point during training, which inflates the reported accuracy without actually testing whether the model has learned anything that generalizes.</w:t>
+        <w:t>Gap 2: Existing ML models frequently rely on randomly divided datasets, allowing samples from the same surface or operating condition to appear in both training and testing sets, and the actual scale of the resulting inflation turned out to be far larger than a single example can convey. On the smallest of the engineered-surface datasets used in this project, averaging only about six or seven rows per publication, knowing only which laboratory produced a given row explained roughly 80.6 percent of the variance in log CHF, more than the roughness and contact angle values the paper was actually about, which added only a further 4.1 percentage points once laboratory identity was already known. The same measurement, repeated across five datasets of increasing size, showed a clean, decreasing pattern: 80.6 percent of variance explained by source identity alone at roughly 7 rows per publication, falling to 73.5 percent at 81 rows per publication, 65.9 percent at 11, and down to 34.5 and 27.3 percent on the two largest, best-populated datasets. A further, more literal version of the same leakage was found hiding inside individual sources even after grouping by source: 578 rows across this project's merged dataset turned out to be exact or near-exact duplicates of other rows in feature space, concentrated overwhelmingly in one compilation where 39 percent of all rows duplicated another row already in the set, and correcting for this alone flipped that dataset's apparent random-split score from a positive 0.066 to a negative 0.016. The most severe version of this problem was not a duplicate row at all: in several of these datasets, the reported flow quality is itself calculated from the measured CHF value through a standard energy balance, so using it as a model input lets a model reconstruct the answer arithmetically rather than predict it. Feeding that quality value back in as an input reproduced CHF on one dataset's 24,443 rows with an R-squared of 0.999771 using nothing but a textbook energy-balance equation and no fitted parameters at all, a direct demonstration of how a model can report a near-perfect score while having learned essentially nothing about CHF. A random split cannot tell any of these three shortcuts apart from genuine physical learning, because it never asks a model to generalize past what it has effectively already been shown.</w:t>
       </w:r>
     </w:p>
     <w:p>
@@ -502,7 +502,7 @@
         <w:pStyle w:val="ListBullet"/>
       </w:pPr>
       <w:r>
-        <w:t>Gap 3: Cross-surface generalization remains insufficiently demonstrated. When two entire surface types, pin-fin pool boiling and helical coils, were withheld completely from training rather than just a condition range, even the best-performing tree-based model in this project's own testing dropped to an R-squared of about 0.17 to 0.22, and the standard neural network and the physics-informed neural network both produced R-squared values below minus 3900. Later testing in this project was built specifically to confront this gap directly, using techniques such as low-rank adapters and mixture-of-experts routing to try to transfer a model trained on tube and annulus data to genuinely new pool-boiling surfaces, rather than assuming a model trained on one geometry will simply carry over to another.</w:t>
+        <w:t>Gap 3: Cross-surface generalization remains insufficiently demonstrated. When two entire surface types, pin-fin pool boiling and helical coils, were withheld completely from training rather than just a condition range, even the best-performing tree-based model in this project's own testing dropped to an R-squared of about 0.17 to 0.22, and the standard neural network and the physics-informed neural network both produced R-squared values below minus 3900. Under a comparably unseen test on axially non-uniform heating conditions, a closed-form physical correlation with no fitted parameters at all reached an R-squared of 0.821, outperforming every machine learning model tested, the best of which reached only minus 0.077. This project's later testing attempted to address cross-surface generalization directly, using low-rank adapters and a mixture-of-experts architecture meant to route pool-boiling inputs to a specialized pathway, but the routing gate itself did not learn that distinction reliably, activating correctly on only about 11 percent of genuine pool-boiling rows while activating on 61 percent of ordinary flow rows, close to the opposite of the pattern it was meant to detect. A related and, on reflection, more fundamental obstacle showed up when this project tried to build a system that could at least recognize when it was being asked about a genuinely new fluid rather than a new surface: representing fluids through dimensionless physical groups, the same approach used in Section 1.4 to address fluid dependence, placed an unseen refrigerant's operating conditions inside the same numerical region as the water data the model had already trained on, so a novelty detector built on that representation flagged zero percent of that refrigerant's data points as unfamiliar, even though the model had never seen that fluid during training. The same representation that helps a model transfer across fluids and surfaces is, by construction, the representation that hides the fact that a fluid or surface has changed, and no solution to that specific tension has yet been found.</w:t>
       </w:r>
     </w:p>
     <w:p>
@@ -510,17 +510,22 @@
         <w:pStyle w:val="ListBullet"/>
       </w:pPr>
       <w:r>
-        <w:t>Gap 4: ML predictions are often treated as black boxes, with limited interpretation of how surface and thermal-hydraulic parameters control CHF. This project's own experience with a physics-informed neural network is a direct illustration of how this gap shows up in practice, not just in principle. The model was originally built around a small, physically motivated set of three core input features, but extending it to ingest the wider and more varied feature sets present across different real experimental datasets, so that it could be tested against data it was not originally designed for, made its internal behavior considerably harder to trace back to any specific physical mechanism. A model that started as a deliberately interpretable, physics-constrained design became, in practice, close to as opaque as a purely data-driven one once it had to accommodate real-world data heterogeneity.</w:t>
+        <w:t>Gap 4: ML predictions are often treated as black boxes, with limited interpretation of how surface and thermal-hydraulic parameters control CHF. This project's own experience with a physics-informed neural network is a direct illustration of how this gap shows up in practice, not just in principle. The model was originally built around a small, physically motivated set of three core input features, but extending it to ingest the wider and more varied feature sets present across different real experimental datasets, so that it could be tested against data it was not originally designed for, made its internal behavior considerably harder to trace back to any specific physical mechanism. The interpretability problem runs deeper than any single model's design: feature-importance rankings computed under an optimistic random split and under an honest, source-grouped split came out essentially unchanged in this project's own testing, even though the honest split's actual predictive accuracy was far worse, which means a feature-importance ranking alone cannot be trusted to reveal whether a model has learned something real or something that will not survive contact with new data. A related blind spot showed up in the models' uncertainty estimates rather than their point predictions: an ensemble of models built specifically to report calibrated 95 percent confidence intervals contained the true CHF value only 9 to 22 percent of the time when tested on genuinely new data, and even after switching to a more principled conformal prediction approach, coverage that reached 92 to 96 percent on familiar, in-distribution data fell to 57 percent on a laboratory the model had never seen. A model that is confidently wrong about its own uncertainty is arguably more concerning for a safety-relevant quantity like CHF than one that is simply less accurate, because it gives a false sense of how much a given prediction should be trusted.</w:t>
       </w:r>
     </w:p>
     <w:p>
       <w:r>
-        <w:t>Beyond these four formal gaps, two practical difficulties stood out repeatedly over the course of this project's own experiments, and both are worth stating plainly rather than glossing over. The first is that assembling usable data was, in practice, harder than training any individual model. Different sources reported different input features, different units, different geometry conventions, and different CHF detection criteria, and merging seven such sources into the collaborator's unified 28,470-row dataset required deciding, source by source, what could be combined honestly and what could not, well before any model was trained. Finding a single architecture that performed acceptably across every one of these differing feature sets and geometries was similarly difficult: a model tuned to do well on tube data with one set of available inputs did not automatically do well once asked to work with a pin-fin dataset carrying an entirely different set of surface descriptors.</w:t>
+        <w:t>Beyond these four formal gaps, two practical difficulties stood out repeatedly over the course of this project's own experiments, and both are worth stating plainly rather than glossing over. The first is that assembling usable data was, in practice, harder than training any individual model, and not in a vague sense. Concrete bugs kept surfacing well after the data looked clean: one exported file had its units row sitting directly beneath the header, so an entire pressure column was read as the text string "kPa" instead of a number until an explicit check caught it; one dataset's diameter column was silently replaced by a hard-coded 8 millimeters whenever the real value was missing, and that placeholder went unnoticed for 1,865 rows spanning true diameters from 1 to 37.5 millimeters, until it was caught by asking why that one dataset was the pipeline's single worst performer; and a property-lookup routine silently substituted water's density and latent heat for any fluid it did not recognize, so a request for an unfamiliar fluid returned a confident, wrong number rather than an error. None of these were modeling failures, and every one of them would have quietly lowered, or in the diameter case actively corrupted, whatever a model built on top of that data claimed to have learned. Finding a single architecture that performed acceptably across every one of these differing feature sets and geometries was similarly difficult, but it turned out to matter less than getting the data itself right: on one of the hardest test splits, correcting unit errors and a poorly populated subcooling column, with no change to the model or any physics assumption, moved that split's accuracy from an R-squared of 0.173 to 0.711, a bigger jump than any single modeling idea tried afterward managed on its own.</w:t>
       </w:r>
     </w:p>
     <w:p>
       <w:r>
-        <w:t>The second difficulty is the one already illustrated by the numbers throughout this introduction, and it is worth stating the interpretation directly. Every tree ensemble and every plain neural network tested in this project's own work reached strong, sometimes excellent, accuracy under interpolation, R-squared values above 0.9 were common, but the same models performed far worse, in several cases catastrophically, once tested under extrapolation. Tree-based models settled around an R-squared of 0.41 to 0.45 under a pressure-based extrapolation split, while standard neural networks and the physics-informed neural network produced sharply negative R-squared values under condition-wise and surface-wise splits. A pattern this consistent, strong performance next to seen data and weak or collapsing performance beyond it, is hard to read as anything other than evidence that these models are not learning the underlying physical relationship governing CHF. What they appear to be doing instead is closer to locating a new point relative to the nearby points they have already seen and interpolating between them, which works well exactly as long as a new point actually has close neighbors in the training data, and fails as soon as it does not.</w:t>
+        <w:t>The second difficulty is the one already illustrated by the numbers throughout this introduction, and it is worth stating the interpretation directly. Every tree ensemble and every plain neural network tested in this project's own work reached strong, sometimes excellent, accuracy under interpolation, R-squared values above 0.9 were common, but the same models performed far worse, in several cases catastrophically, once tested under extrapolation. Tree-based models settled around an R-squared of 0.41 to 0.45 under a pressure-based extrapolation split, while standard neural networks and the physics-informed neural network produced sharply negative R-squared values under condition-wise and surface-wise splits, and in one leave-one-publication-out test a plain linear regression outperformed considerably more sophisticated methods, including gradient-boosted trees and Gaussian process regression, a further sign that model complexity does not, by itself, buy generalization. A pattern this consistent, strong performance next to seen data and weak or collapsing performance beyond it, is hard to read as anything other than evidence that these models are not learning the underlying physical relationship governing CHF. What they appear to be doing instead is closer to locating a new point relative to the nearby points they have already seen and interpolating between them, which works well exactly as long as a new point actually has close neighbors in the training data, and fails as soon as it does not.</w:t>
+      </w:r>
+    </w:p>
+    <w:p>
+      <w:r>
+        <w:t>Combining multiple models did not fix this either, which matters because stacking or ensembling is often the first thing reached for when a single model looks unreliable. Under an honest, source-grouped evaluation in this project's own testing, a stacked ensemble of several model types scored an R-squared of 0.459, against 0.945 for a single tree-based model evaluated the same way, because the ensemble's own combination weights were fit on the training laboratories and simply learned to trust whichever base model looked best on data it had already seen. Adding models on top of models does not add physical understanding; it adds another layer that can itself overfit to source identity.</w:t>
       </w:r>
     </w:p>
     <w:p>
@@ -616,7 +621,7 @@
     </w:p>
     <w:p>
       <w:r>
-        <w:t>Before any of the modeling described later in this paper is possible, every experimental CHF value in the underlying dataset first has to be identified from raw sensor readings, and that identification step is not as clean cut as it might sound. Different experimental facilities use different rules for deciding, from a stream of pressure, temperature, and heat flux measurements, exactly which data point counts as CHF. Four detection criteria account for most of the approaches used across the wider literature and across the sources merged into this project's own dataset.</w:t>
+        <w:t>Before any of the modeling described later in this paper is possible, every experimental CHF value in the underlying dataset first has to be identified from raw sensor readings, and that identification step is not as clean cut as it might sound. Different experimental facilities use different rules for deciding, from a stream of pressure, temperature, heat flux, acoustic, or image measurements, exactly which data point counts as CHF. The outline for this project names four criteria, and two more, drawn from the wider CHF literature, are worth adding because they show up increasingly often in recent experimental and machine-learning-adjacent work.</w:t>
       </w:r>
     </w:p>
     <w:p>
@@ -652,8 +657,90 @@
       </w:r>
     </w:p>
     <w:p>
+      <w:pPr>
+        <w:pStyle w:val="ListBullet"/>
+      </w:pPr>
       <w:r>
-        <w:t>These four criteria do not always identify exactly the same physical instant, and switching between them, even applied to the same raw data, can shift the reported CHF value by a small but nonzero amount. Because the dataset used later in this paper is merged from multiple independent sources, each of which may have used a different one of these four criteria, this is itself a real, concrete source of the label noise and cross-source inconsistency discussed elsewhere in this paper, and one more reason why a CHF prediction model needs to be evaluated with some tolerance for the fact that its training labels were not all produced by an identical measurement procedure.</w:t>
+        <w:t>Criterion 5, acoustic emission. Bubble nucleation, growth, and collapse generate small, rapid pressure fluctuations in the liquid, and these can be picked up non-intrusively by a microphone or transducer mounted outside the test section rather than in contact with the heated surface at all. As boiling approaches CHF, the character of this acoustic signal changes in ways that correlate with the transition from nucleate boiling to film boiling, and recent work has combined externally measured acoustic emission signals with deep learning models to detect CHF directly from sound, tracked continuously from natural convection through to the critical point. This criterion is particularly useful where thermocouples or optical access are impractical, for example in harsh or enclosed industrial equipment.</w:t>
+      </w:r>
+    </w:p>
+    <w:p>
+      <w:pPr>
+        <w:pStyle w:val="ListBullet"/>
+      </w:pPr>
+      <w:r>
+        <w:t>Criterion 6, image-based machine-learning classification. This criterion is a direct extension of Criterion 4 rather than a wholly separate physical signal: instead of a person or a fixed image-processing rule identifying dry-patch formation from high-speed video, a trained deep learning model is used to classify boiling-regime images or bubble morphology frame by frame and flag the onset of CHF automatically. Reported results show that such models can correlate bubble morphology with the actual measured heat flux even when the resolution or frame rate of the images is reduced, which makes this approach attractive as a way of processing very large volumes of high-speed video without a human reviewing every frame by eye, and it is the one criterion on this list that is itself a small CHF prediction model rather than a fixed physical rule.</w:t>
+      </w:r>
+    </w:p>
+    <w:p>
+      <w:r>
+        <w:t>These six criteria do not always identify exactly the same physical instant, and switching between them, even applied to the same raw data, can shift the reported CHF value by a small but nonzero amount. Because the dataset used later in this paper is merged from multiple independent sources, each of which may have used a different one of these four criteria, this is itself a real, concrete source of the label noise and cross-source inconsistency discussed elsewhere in this paper, and one more reason why a CHF prediction model needs to be evaluated with some tolerance for the fact that its training labels were not all produced by an identical measurement procedure. The two additional criteria are also worth flagging for a different reason: a model trained to detect CHF from acoustic or image data is, in effect, a separate machine learning system sitting upstream of the CHF prediction models discussed later in this paper, and any bias or error in that upstream detector becomes part of the ground truth the downstream CHF model is trained against, whether or not that error is ever reported.</w:t>
+      </w:r>
+    </w:p>
+    <w:p>
+      <w:pPr>
+        <w:pStyle w:val="Heading1"/>
+      </w:pPr>
+      <w:r>
+        <w:t>3. Machine-Learning Methodology</w:t>
+      </w:r>
+    </w:p>
+    <w:p>
+      <w:pPr>
+        <w:pStyle w:val="Heading2"/>
+      </w:pPr>
+      <w:r>
+        <w:t>3.1 Data Preprocessing</w:t>
+      </w:r>
+    </w:p>
+    <w:p>
+      <w:r>
+        <w:t>Merging independent CHF datasets into a single modeling table, described in Section 2, does not by itself produce something a model can be trained on safely. The merged schema used in this project carries 51 columns once every source's fields are combined, and getting from that raw merge to a trustworthy training set involved five distinct kinds of preprocessing work: deciding what to do about missing values, deciding which unusual points were real and which were errors, choosing how to scale the inputs and the target, checking which features actually carried independent information, and working out what the effective dimensionality of the problem really was.</w:t>
+      </w:r>
+    </w:p>
+    <w:p>
+      <w:pPr>
+        <w:pStyle w:val="ListBullet"/>
+      </w:pPr>
+      <w:r>
+        <w:t>Missing-value treatment. Column coverage across the merged dataset is extremely uneven. Core flow variables such as CHF itself, mass flux, and geometry family are present on effectively every row, heated length, quality, and pressure are present on more than 99 percent of rows, and diameter is present on 98.3 percent, but surface-specific columns such as roughness factor and surface material are present on well under 1 percent of rows, simply because the great majority of sources never measured them. The rule adopted throughout this project is to never impute a value a source does not report, rather than filling a gap with a column mean, a model-based estimate, or any other guess. This matters because two different kinds of missingness are easy to confuse: a pool-boiling dataset has no mass flux or quality because there is no forced flow to measure, which is a physically meaningful absence, not missing data in the usual sense, while a flow-boiling paper that simply never reported subcooling is missing data that does, in principle, exist. Only the second kind is a candidate for careful imputation at all, and even there this project chose to leave the gap as a genuine missing value rather than invent a number, so that no model result can be quietly resting on an assumption dressed up as a measurement.</w:t>
+      </w:r>
+    </w:p>
+    <w:p>
+      <w:pPr>
+        <w:pStyle w:val="ListBullet"/>
+      </w:pPr>
+      <w:r>
+        <w:t>Outlier detection. The instruction not to remove outliers blindly is worth taking seriously, because this dataset contains at least three genuinely different situations that a single statistical outlier rule would treat identically and should not. First, CHF itself spans three orders of magnitude, from about 15 to over 44,000 kW per square meter, so a small number of very high or very low values are real physical outcomes at extreme pressure, mass flux, or subcooling combinations, not errors, and a naive standard-deviation filter would delete exactly the high-CHF conditions that matter most for margin calculations. Second, some points are genuinely suspect due to how they were collected rather than what they measure: one dataset used in this project was digitized by eye from a published scatter plot, which carries an estimated 5 to 10 percent error on both axes, and this project's response was not to delete those points but to keep them clearly labeled as a lower-trust source used only for out-of-distribution testing, never for training. Third, some apparent outliers are unresolved disagreements in the literature itself: one pool-boiling study's own published text gives CHF values for its coated surfaces that do not match the range quoted for the same study in a later review paper, and rather than guessing which source was right, the values were kept exactly as printed in the original paper and the discrepancy was documented rather than silently resolved. A fourth case is not an outlier at all but a data-entry defect masquerading as one: a diameter column that had silently defaulted to a fixed placeholder value whenever the true diameter was missing was only caught because the affected dataset was the pipeline's worst performer, and the fix there was to correct the underlying value, not to remove the rows.</w:t>
+      </w:r>
+    </w:p>
+    <w:p>
+      <w:pPr>
+        <w:pStyle w:val="ListBullet"/>
+      </w:pPr>
+      <w:r>
+        <w:t>Normalization and standardization. Because CHF spans three orders of magnitude, every model in this project is trained on the logarithm of CHF rather than the raw value, with predictions exponentiated back before any accuracy metric is computed. For the input side, an early baseline simply standardized the raw physical variables to zero mean and unit variance before fitting, which is a reasonable default but treats pressure, mass flux, and fluid identity as arbitrary numbers to be rescaled rather than physical quantities with known relationships to each other. The approach carried into the final pipeline instead collapses the fluid and flow variables into a small set of dimensionless physical groups, an inverse Weber number, a density ratio, a length-to-diameter ratio, a subcooling ratio, and a reduced pressure, so that water at 15 megapascals and a refrigerant at 1 megapascal that are in physically equivalent states map to the same point in the input space. This is not just a scaling convenience: tested directly, moving from raw standardized inputs to this dimensionless formulation improved cross-fluid prediction error by a factor of roughly 10 to 32, while leaving within-fluid accuracy essentially unchanged, 0.851 against 0.849 R-squared, which is the control that shows the gain is coming from better cross-fluid normalization and not from some unrelated side effect.</w:t>
+      </w:r>
+    </w:p>
+    <w:p>
+      <w:pPr>
+        <w:pStyle w:val="ListBullet"/>
+      </w:pPr>
+      <w:r>
+        <w:t>Feature correlation analysis. Run naively on data pooled from many independent laboratories, a feature correlation analysis in this project turned out to be actively misleading rather than simply noisy. Computed across pooled engineered-surface data, the correlation between surface roughness and CHF came out negative, but computed within each individual study it came out positive, matching the physical mechanism the source papers themselves describe. Extending the same kind of analysis to ask how much variance a purely administrative variable, which laboratory produced a given row, explains on its own, rather than only checking physical features against the target, is what first revealed that source identity alone can account for the majority of the apparent signal in a small dataset. Correlation analysis was also used directly as a leakage-detection tool rather than only a feature-selection one: several columns in the merged data, including one combination of electrical power, perimeter, and flow area in one dataset, and a heater-power column in another, reconstructed the CHF target almost exactly through simple algebra once checked, and were excluded once that reconstruction was confirmed. In this project, feature correlation analysis removed at least as much as it selected.</w:t>
+      </w:r>
+    </w:p>
+    <w:p>
+      <w:pPr>
+        <w:pStyle w:val="ListBullet"/>
+      </w:pPr>
+      <w:r>
+        <w:t>Dimensionality analysis. The physical problem itself is low-dimensional: CHF in flow boiling is conventionally described by four or five variables, pressure, mass flux, quality, diameter, and heated length, plus fluid identity, so this project never faced the classic high-dimensional setting that would call for something like principal component analysis. The dimensionality problem that did show up came from merging, not from the physics: once seven independent sources were combined, the resulting schema carried 51 columns, because each source contributed its own geometry- or surface-specific descriptors, and the great majority of those columns are populated on well under 10 percent of rows. The practical dimensionality question in this project was therefore not how to compress a rich feature space, but how to decide, column by column, which of these sparsely populated fields could be used at all without either discarding most of the dataset by requiring every column to be present, or inventing values for rows that never measured that quantity in the first place. The dimensionless feature construction described above served this purpose as well, replacing a long, sparse tail of source-specific raw columns with a small, fixed set of variables that apply to every row regardless of which source it came from.</w:t>
+      </w:r>
+    </w:p>
+    <w:p>
+      <w:r>
+        <w:t>None of these five preprocessing decisions were free of consequence, and it is worth restating the finding from Section 1.8 in this context: on one of the hardest test splits used in this project, correcting a handful of data-preprocessing issues, unit errors and a poorly populated column, with no change to the model or to any physics assumption, moved that split's accuracy from an R-squared of 0.173 to 0.711. In this project, the preprocessing choices described above turned out to matter at least as much as which model was ultimately trained on the result.</w:t>
       </w:r>
     </w:p>
     <w:sectPr>

</xml_diff>